<commit_message>
update: JS 6 Week 4
</commit_message>
<xml_diff>
--- a/Matkul_Semester_6/Pemrograman Berbasis Framework/week 4/5.JOBSHEET PRAKTIKUM-Styling.docx
+++ b/Matkul_Semester_6/Pemrograman Berbasis Framework/week 4/5.JOBSHEET PRAKTIKUM-Styling.docx
@@ -2,6 +2,534 @@
 <file path=word/document.xml><?xml version="1.0" encoding="utf-8"?>
 <w:document xmlns:wpc="http://schemas.microsoft.com/office/word/2010/wordprocessingCanvas" xmlns:cx="http://schemas.microsoft.com/office/drawing/2014/chartex" xmlns:cx1="http://schemas.microsoft.com/office/drawing/2015/9/8/chartex" xmlns:cx2="http://schemas.microsoft.com/office/drawing/2015/10/21/chartex" xmlns:cx3="http://schemas.microsoft.com/office/drawing/2016/5/9/chartex" xmlns:cx4="http://schemas.microsoft.com/office/drawing/2016/5/10/chartex" xmlns:cx5="http://schemas.microsoft.com/office/drawing/2016/5/11/chartex" xmlns:cx6="http://schemas.microsoft.com/office/drawing/2016/5/12/chartex" xmlns:cx7="http://schemas.microsoft.com/office/drawing/2016/5/13/chartex" xmlns:cx8="http://schemas.microsoft.com/office/drawing/2016/5/14/chartex" xmlns:mc="http://schemas.openxmlformats.org/markup-compatibility/2006" xmlns:aink="http://schemas.microsoft.com/office/drawing/2016/ink" xmlns:am3d="http://schemas.microsoft.com/office/drawing/2017/model3d" xmlns:o="urn:schemas-microsoft-com:office:office" xmlns:oel="http://schemas.microsoft.com/office/2019/extlst" xmlns:r="http://schemas.openxmlformats.org/officeDocument/2006/relationships" xmlns:m="http://schemas.openxmlformats.org/officeDocument/2006/math" xmlns:v="urn:schemas-microsoft-com:vml" xmlns:wp14="http://schemas.microsoft.com/office/word/2010/wordprocessingDrawing" xmlns:wp="http://schemas.openxmlformats.org/drawingml/2006/wordprocessingDrawing" xmlns:w10="urn:schemas-microsoft-com:office:word" xmlns:w="http://schemas.openxmlformats.org/wordprocessingml/2006/main" xmlns:w14="http://schemas.microsoft.com/office/word/2010/wordml" xmlns:w15="http://schemas.microsoft.com/office/word/2012/wordml" xmlns:w16cex="http://schemas.microsoft.com/office/word/2018/wordml/cex" xmlns:w16cid="http://schemas.microsoft.com/office/word/2016/wordml/cid" xmlns:w16="http://schemas.microsoft.com/office/word/2018/wordml" xmlns:w16du="http://schemas.microsoft.com/office/word/2023/wordml/word16du" xmlns:w16sdtdh="http://schemas.microsoft.com/office/word/2020/wordml/sdtdatahash" xmlns:w16sdtfl="http://schemas.microsoft.com/office/word/2024/wordml/sdtformatlock" xmlns:w16se="http://schemas.microsoft.com/office/word/2015/wordml/symex" xmlns:wpg="http://schemas.microsoft.com/office/word/2010/wordprocessingGroup" xmlns:wpi="http://schemas.microsoft.com/office/word/2010/wordprocessingInk" xmlns:wne="http://schemas.microsoft.com/office/word/2006/wordml" xmlns:wps="http://schemas.microsoft.com/office/word/2010/wordprocessingShape" mc:Ignorable="w14 w15 w16se w16cid w16 w16cex w16sdtdh w16sdtfl w16du wp14">
   <w:body>
+    <w:sdt>
+      <w:sdtPr>
+        <w:rPr>
+          <w:rFonts w:ascii="Times New Roman" w:hAnsi="Times New Roman" w:cs="Times New Roman"/>
+          <w:color w:val="4F81BD" w:themeColor="accent1"/>
+          <w:sz w:val="24"/>
+          <w:szCs w:val="24"/>
+        </w:rPr>
+        <w:id w:val="-1900282036"/>
+        <w:docPartObj>
+          <w:docPartGallery w:val="Cover Pages"/>
+          <w:docPartUnique/>
+        </w:docPartObj>
+      </w:sdtPr>
+      <w:sdtEndPr>
+        <w:rPr>
+          <w:color w:val="auto"/>
+        </w:rPr>
+      </w:sdtEndPr>
+      <w:sdtContent>
+        <w:p>
+          <w:pPr>
+            <w:pBdr>
+              <w:top w:val="nil"/>
+              <w:left w:val="nil"/>
+              <w:bottom w:val="nil"/>
+              <w:right w:val="nil"/>
+              <w:between w:val="nil"/>
+            </w:pBdr>
+            <w:spacing w:line="276" w:lineRule="auto"/>
+            <w:jc w:val="center"/>
+            <w:rPr>
+              <w:rFonts w:ascii="Times New Roman" w:hAnsi="Times New Roman" w:cs="Times New Roman"/>
+              <w:b/>
+              <w:color w:val="000000"/>
+              <w:sz w:val="24"/>
+              <w:szCs w:val="24"/>
+            </w:rPr>
+          </w:pPr>
+          <w:r>
+            <w:rPr>
+              <w:rFonts w:ascii="Times New Roman" w:hAnsi="Times New Roman" w:cs="Times New Roman"/>
+              <w:b/>
+              <w:color w:val="000000"/>
+              <w:sz w:val="24"/>
+              <w:szCs w:val="24"/>
+            </w:rPr>
+            <w:t>LAPORAN PRAKTIKUM</w:t>
+          </w:r>
+        </w:p>
+        <w:p>
+          <w:pPr>
+            <w:pBdr>
+              <w:top w:val="nil"/>
+              <w:left w:val="nil"/>
+              <w:bottom w:val="nil"/>
+              <w:right w:val="nil"/>
+              <w:between w:val="nil"/>
+            </w:pBdr>
+            <w:spacing w:line="276" w:lineRule="auto"/>
+            <w:jc w:val="center"/>
+            <w:rPr>
+              <w:rFonts w:ascii="Times New Roman" w:hAnsi="Times New Roman" w:cs="Times New Roman"/>
+              <w:b/>
+              <w:color w:val="000000"/>
+              <w:sz w:val="24"/>
+              <w:szCs w:val="24"/>
+              <w:lang w:val="en-US"/>
+            </w:rPr>
+          </w:pPr>
+          <w:r>
+            <w:rPr>
+              <w:rFonts w:ascii="Times New Roman" w:hAnsi="Times New Roman" w:cs="Times New Roman"/>
+              <w:b/>
+              <w:color w:val="000000"/>
+              <w:sz w:val="24"/>
+              <w:szCs w:val="24"/>
+            </w:rPr>
+            <w:t>PEMROGRAMAN BERBASIS FRAMEWORK</w:t>
+          </w:r>
+        </w:p>
+        <w:p>
+          <w:pPr>
+            <w:spacing w:line="360" w:lineRule="auto"/>
+            <w:jc w:val="center"/>
+            <w:rPr>
+              <w:rFonts w:ascii="Times New Roman" w:hAnsi="Times New Roman" w:cs="Times New Roman"/>
+              <w:b/>
+              <w:color w:val="000000"/>
+              <w:sz w:val="24"/>
+              <w:szCs w:val="24"/>
+              <w:lang w:val="en-US"/>
+            </w:rPr>
+          </w:pPr>
+        </w:p>
+        <w:p>
+          <w:pPr>
+            <w:spacing w:line="360" w:lineRule="auto"/>
+            <w:jc w:val="center"/>
+            <w:rPr>
+              <w:rFonts w:ascii="Times New Roman" w:hAnsi="Times New Roman" w:cs="Times New Roman"/>
+              <w:b/>
+              <w:color w:val="000000"/>
+              <w:sz w:val="24"/>
+              <w:szCs w:val="24"/>
+              <w:lang w:val="en-US"/>
+            </w:rPr>
+          </w:pPr>
+        </w:p>
+        <w:p>
+          <w:pPr>
+            <w:spacing w:line="360" w:lineRule="auto"/>
+            <w:jc w:val="center"/>
+            <w:rPr>
+              <w:rFonts w:ascii="Times New Roman" w:hAnsi="Times New Roman" w:cs="Times New Roman"/>
+              <w:b/>
+              <w:color w:val="000000"/>
+              <w:sz w:val="24"/>
+              <w:szCs w:val="24"/>
+              <w:lang w:val="en-US"/>
+            </w:rPr>
+          </w:pPr>
+        </w:p>
+        <w:p>
+          <w:pPr>
+            <w:spacing w:before="161"/>
+            <w:ind w:right="90"/>
+            <w:jc w:val="center"/>
+            <w:rPr>
+              <w:rFonts w:ascii="Times New Roman" w:hAnsi="Times New Roman" w:cs="Times New Roman"/>
+              <w:b/>
+              <w:sz w:val="24"/>
+              <w:szCs w:val="24"/>
+            </w:rPr>
+          </w:pPr>
+          <w:r>
+            <w:rPr>
+              <w:rFonts w:ascii="Times New Roman" w:hAnsi="Times New Roman" w:cs="Times New Roman"/>
+              <w:b/>
+              <w:bCs/>
+              <w:sz w:val="24"/>
+              <w:szCs w:val="24"/>
+            </w:rPr>
+            <w:t xml:space="preserve">WEEK </w:t>
+          </w:r>
+          <w:r>
+            <w:rPr>
+              <w:rFonts w:ascii="Times New Roman" w:hAnsi="Times New Roman" w:cs="Times New Roman"/>
+              <w:b/>
+              <w:bCs/>
+              <w:sz w:val="24"/>
+              <w:szCs w:val="24"/>
+            </w:rPr>
+            <w:t>5</w:t>
+          </w:r>
+          <w:r>
+            <w:rPr>
+              <w:rFonts w:ascii="Times New Roman" w:hAnsi="Times New Roman" w:cs="Times New Roman"/>
+              <w:b/>
+              <w:bCs/>
+              <w:sz w:val="24"/>
+              <w:szCs w:val="24"/>
+            </w:rPr>
+            <w:t xml:space="preserve">: </w:t>
+          </w:r>
+          <w:r>
+            <w:rPr>
+              <w:b/>
+            </w:rPr>
+            <w:t>Styling pada Next.js (Global CSS, CSS Module, Inline Style, SCSS, dan Tailwind CSS)</w:t>
+          </w:r>
+          <w:r>
+            <w:rPr>
+              <w:b/>
+            </w:rPr>
+            <w:t xml:space="preserve"> </w:t>
+          </w:r>
+        </w:p>
+        <w:p>
+          <w:pPr>
+            <w:spacing w:line="360" w:lineRule="auto"/>
+            <w:ind w:left="1418" w:right="1563"/>
+            <w:jc w:val="center"/>
+            <w:rPr>
+              <w:rFonts w:ascii="Times New Roman" w:hAnsi="Times New Roman" w:cs="Times New Roman"/>
+              <w:b/>
+              <w:bCs/>
+              <w:sz w:val="24"/>
+              <w:szCs w:val="24"/>
+            </w:rPr>
+          </w:pPr>
+        </w:p>
+        <w:p>
+          <w:pPr>
+            <w:spacing w:line="360" w:lineRule="auto"/>
+            <w:rPr>
+              <w:rFonts w:ascii="Times New Roman" w:hAnsi="Times New Roman" w:cs="Times New Roman"/>
+              <w:b/>
+              <w:bCs/>
+              <w:sz w:val="24"/>
+              <w:szCs w:val="24"/>
+            </w:rPr>
+          </w:pPr>
+        </w:p>
+        <w:p>
+          <w:pPr>
+            <w:spacing w:line="360" w:lineRule="auto"/>
+            <w:rPr>
+              <w:rFonts w:ascii="Times New Roman" w:hAnsi="Times New Roman" w:cs="Times New Roman"/>
+              <w:b/>
+              <w:bCs/>
+              <w:sz w:val="24"/>
+              <w:szCs w:val="24"/>
+            </w:rPr>
+          </w:pPr>
+        </w:p>
+        <w:p>
+          <w:pPr>
+            <w:spacing w:line="360" w:lineRule="auto"/>
+            <w:rPr>
+              <w:rFonts w:ascii="Times New Roman" w:hAnsi="Times New Roman" w:cs="Times New Roman"/>
+              <w:b/>
+              <w:bCs/>
+              <w:sz w:val="24"/>
+              <w:szCs w:val="24"/>
+            </w:rPr>
+          </w:pPr>
+        </w:p>
+        <w:p>
+          <w:pPr>
+            <w:spacing w:line="360" w:lineRule="auto"/>
+            <w:jc w:val="center"/>
+            <w:rPr>
+              <w:rFonts w:ascii="Times New Roman" w:hAnsi="Times New Roman" w:cs="Times New Roman"/>
+              <w:noProof/>
+              <w:sz w:val="24"/>
+              <w:szCs w:val="24"/>
+            </w:rPr>
+          </w:pPr>
+        </w:p>
+        <w:p>
+          <w:pPr>
+            <w:spacing w:line="360" w:lineRule="auto"/>
+            <w:jc w:val="center"/>
+            <w:rPr>
+              <w:rFonts w:ascii="Times New Roman" w:hAnsi="Times New Roman" w:cs="Times New Roman"/>
+              <w:b/>
+              <w:bCs/>
+              <w:sz w:val="24"/>
+              <w:szCs w:val="24"/>
+            </w:rPr>
+          </w:pPr>
+          <w:r>
+            <w:rPr>
+              <w:rFonts w:ascii="Times New Roman" w:hAnsi="Times New Roman" w:cs="Times New Roman"/>
+              <w:noProof/>
+              <w:sz w:val="24"/>
+              <w:szCs w:val="24"/>
+              <w:lang w:val="en-US"/>
+            </w:rPr>
+            <w:drawing>
+              <wp:inline distT="0" distB="0" distL="0" distR="0" wp14:anchorId="38A8A5D3" wp14:editId="38EE7003">
+                <wp:extent cx="1773357" cy="1676400"/>
+                <wp:effectExtent l="0" t="0" r="0" b="0"/>
+                <wp:docPr id="148360248" name="image1.png" descr="poltek"/>
+                <wp:cNvGraphicFramePr/>
+                <a:graphic xmlns:a="http://schemas.openxmlformats.org/drawingml/2006/main">
+                  <a:graphicData uri="http://schemas.openxmlformats.org/drawingml/2006/picture">
+                    <pic:pic xmlns:pic="http://schemas.openxmlformats.org/drawingml/2006/picture">
+                      <pic:nvPicPr>
+                        <pic:cNvPr id="0" name="image1.png" descr="poltek"/>
+                        <pic:cNvPicPr preferRelativeResize="0"/>
+                      </pic:nvPicPr>
+                      <pic:blipFill>
+                        <a:blip r:embed="rId5"/>
+                        <a:srcRect/>
+                        <a:stretch>
+                          <a:fillRect/>
+                        </a:stretch>
+                      </pic:blipFill>
+                      <pic:spPr>
+                        <a:xfrm>
+                          <a:off x="0" y="0"/>
+                          <a:ext cx="1773357" cy="1676400"/>
+                        </a:xfrm>
+                        <a:prstGeom prst="rect">
+                          <a:avLst/>
+                        </a:prstGeom>
+                        <a:ln/>
+                      </pic:spPr>
+                    </pic:pic>
+                  </a:graphicData>
+                </a:graphic>
+              </wp:inline>
+            </w:drawing>
+          </w:r>
+        </w:p>
+        <w:p>
+          <w:pPr>
+            <w:spacing w:line="360" w:lineRule="auto"/>
+            <w:jc w:val="center"/>
+            <w:rPr>
+              <w:rFonts w:ascii="Times New Roman" w:hAnsi="Times New Roman" w:cs="Times New Roman"/>
+              <w:b/>
+              <w:bCs/>
+              <w:sz w:val="24"/>
+              <w:szCs w:val="24"/>
+            </w:rPr>
+          </w:pPr>
+        </w:p>
+        <w:p>
+          <w:pPr>
+            <w:spacing w:line="360" w:lineRule="auto"/>
+            <w:jc w:val="center"/>
+            <w:rPr>
+              <w:rFonts w:ascii="Times New Roman" w:hAnsi="Times New Roman" w:cs="Times New Roman"/>
+              <w:b/>
+              <w:bCs/>
+              <w:sz w:val="24"/>
+              <w:szCs w:val="24"/>
+            </w:rPr>
+          </w:pPr>
+        </w:p>
+        <w:p>
+          <w:pPr>
+            <w:spacing w:line="360" w:lineRule="auto"/>
+            <w:jc w:val="center"/>
+            <w:rPr>
+              <w:rFonts w:ascii="Times New Roman" w:hAnsi="Times New Roman" w:cs="Times New Roman"/>
+              <w:b/>
+              <w:bCs/>
+              <w:sz w:val="24"/>
+              <w:szCs w:val="24"/>
+            </w:rPr>
+          </w:pPr>
+        </w:p>
+        <w:p>
+          <w:pPr>
+            <w:spacing w:line="360" w:lineRule="auto"/>
+            <w:jc w:val="center"/>
+            <w:rPr>
+              <w:rFonts w:ascii="Times New Roman" w:hAnsi="Times New Roman" w:cs="Times New Roman"/>
+              <w:b/>
+              <w:bCs/>
+              <w:sz w:val="24"/>
+              <w:szCs w:val="24"/>
+            </w:rPr>
+          </w:pPr>
+        </w:p>
+        <w:p>
+          <w:pPr>
+            <w:jc w:val="center"/>
+            <w:rPr>
+              <w:rFonts w:ascii="Times New Roman" w:hAnsi="Times New Roman" w:cs="Times New Roman"/>
+              <w:b/>
+              <w:sz w:val="24"/>
+              <w:szCs w:val="24"/>
+            </w:rPr>
+          </w:pPr>
+          <w:r>
+            <w:rPr>
+              <w:rFonts w:ascii="Times New Roman" w:hAnsi="Times New Roman" w:cs="Times New Roman"/>
+              <w:b/>
+              <w:sz w:val="24"/>
+              <w:szCs w:val="24"/>
+            </w:rPr>
+            <w:t>Disusun Oleh :</w:t>
+          </w:r>
+        </w:p>
+        <w:p>
+          <w:pPr>
+            <w:shd w:val="clear" w:color="auto" w:fill="FFFFFF"/>
+            <w:jc w:val="center"/>
+            <w:rPr>
+              <w:rFonts w:ascii="Times New Roman" w:hAnsi="Times New Roman" w:cs="Times New Roman"/>
+              <w:bCs/>
+              <w:sz w:val="24"/>
+              <w:szCs w:val="24"/>
+            </w:rPr>
+          </w:pPr>
+          <w:r>
+            <w:rPr>
+              <w:rFonts w:ascii="Times New Roman" w:hAnsi="Times New Roman" w:cs="Times New Roman"/>
+              <w:bCs/>
+              <w:sz w:val="24"/>
+              <w:szCs w:val="24"/>
+            </w:rPr>
+            <w:t>Ghoffar Abdul Ja’far 2341720035/TI3B</w:t>
+          </w:r>
+        </w:p>
+        <w:p>
+          <w:pPr>
+            <w:spacing w:line="360" w:lineRule="auto"/>
+            <w:jc w:val="center"/>
+            <w:rPr>
+              <w:rFonts w:ascii="Times New Roman" w:hAnsi="Times New Roman" w:cs="Times New Roman"/>
+              <w:b/>
+              <w:bCs/>
+              <w:sz w:val="24"/>
+              <w:szCs w:val="24"/>
+            </w:rPr>
+          </w:pPr>
+        </w:p>
+        <w:p>
+          <w:pPr>
+            <w:spacing w:line="360" w:lineRule="auto"/>
+            <w:rPr>
+              <w:rFonts w:ascii="Times New Roman" w:hAnsi="Times New Roman" w:cs="Times New Roman"/>
+              <w:b/>
+              <w:bCs/>
+              <w:sz w:val="24"/>
+              <w:szCs w:val="24"/>
+            </w:rPr>
+          </w:pPr>
+        </w:p>
+        <w:p>
+          <w:pPr>
+            <w:spacing w:line="360" w:lineRule="auto"/>
+            <w:rPr>
+              <w:rFonts w:ascii="Times New Roman" w:hAnsi="Times New Roman" w:cs="Times New Roman"/>
+              <w:b/>
+              <w:bCs/>
+              <w:sz w:val="24"/>
+              <w:szCs w:val="24"/>
+            </w:rPr>
+          </w:pPr>
+        </w:p>
+        <w:p>
+          <w:pPr>
+            <w:spacing w:line="360" w:lineRule="auto"/>
+            <w:rPr>
+              <w:rFonts w:ascii="Times New Roman" w:hAnsi="Times New Roman" w:cs="Times New Roman"/>
+              <w:b/>
+              <w:bCs/>
+              <w:sz w:val="24"/>
+              <w:szCs w:val="24"/>
+            </w:rPr>
+          </w:pPr>
+        </w:p>
+        <w:p>
+          <w:pPr>
+            <w:spacing w:line="360" w:lineRule="auto"/>
+            <w:rPr>
+              <w:rFonts w:ascii="Times New Roman" w:hAnsi="Times New Roman" w:cs="Times New Roman"/>
+              <w:b/>
+              <w:bCs/>
+              <w:sz w:val="24"/>
+              <w:szCs w:val="24"/>
+            </w:rPr>
+          </w:pPr>
+        </w:p>
+        <w:p>
+          <w:pPr>
+            <w:spacing w:line="360" w:lineRule="auto"/>
+            <w:rPr>
+              <w:rFonts w:ascii="Times New Roman" w:hAnsi="Times New Roman" w:cs="Times New Roman"/>
+              <w:b/>
+              <w:bCs/>
+              <w:sz w:val="24"/>
+              <w:szCs w:val="24"/>
+            </w:rPr>
+          </w:pPr>
+        </w:p>
+        <w:p>
+          <w:pPr>
+            <w:jc w:val="center"/>
+            <w:rPr>
+              <w:rFonts w:ascii="Times New Roman" w:hAnsi="Times New Roman" w:cs="Times New Roman"/>
+              <w:b/>
+              <w:sz w:val="24"/>
+              <w:szCs w:val="24"/>
+              <w:lang w:val="en-US"/>
+            </w:rPr>
+          </w:pPr>
+          <w:r>
+            <w:rPr>
+              <w:rFonts w:ascii="Times New Roman" w:hAnsi="Times New Roman" w:cs="Times New Roman"/>
+              <w:b/>
+              <w:sz w:val="24"/>
+              <w:szCs w:val="24"/>
+              <w:lang w:val="en-US"/>
+            </w:rPr>
+            <w:t>JURUSAN TEKNOLOGI INFORMASI</w:t>
+          </w:r>
+        </w:p>
+        <w:p>
+          <w:pPr>
+            <w:jc w:val="center"/>
+            <w:rPr>
+              <w:rFonts w:ascii="Times New Roman" w:hAnsi="Times New Roman" w:cs="Times New Roman"/>
+              <w:b/>
+              <w:sz w:val="24"/>
+              <w:szCs w:val="24"/>
+            </w:rPr>
+          </w:pPr>
+          <w:r>
+            <w:rPr>
+              <w:rFonts w:ascii="Times New Roman" w:hAnsi="Times New Roman" w:cs="Times New Roman"/>
+              <w:b/>
+              <w:sz w:val="24"/>
+              <w:szCs w:val="24"/>
+            </w:rPr>
+            <w:t>POLITEKNIK NEGERI MALANG</w:t>
+          </w:r>
+        </w:p>
+        <w:p>
+          <w:pPr>
+            <w:spacing w:before="42"/>
+            <w:ind w:left="23"/>
+            <w:jc w:val="center"/>
+            <w:rPr>
+              <w:rFonts w:ascii="Times New Roman" w:hAnsi="Times New Roman" w:cs="Times New Roman"/>
+              <w:sz w:val="24"/>
+              <w:szCs w:val="24"/>
+            </w:rPr>
+          </w:pPr>
+          <w:r>
+            <w:rPr>
+              <w:rFonts w:ascii="Times New Roman" w:hAnsi="Times New Roman" w:cs="Times New Roman"/>
+              <w:b/>
+              <w:sz w:val="24"/>
+              <w:szCs w:val="24"/>
+            </w:rPr>
+            <w:t>2025/2026</w:t>
+          </w:r>
+        </w:p>
+      </w:sdtContent>
+    </w:sdt>
     <w:p>
       <w:pPr>
         <w:spacing w:before="42"/>
@@ -14,6 +542,28 @@
         <w:rPr>
           <w:b/>
         </w:rPr>
+        <w:t xml:space="preserve"> </w:t>
+      </w:r>
+      <w:r>
+        <w:rPr>
+          <w:b/>
+        </w:rPr>
+        <w:br w:type="page"/>
+      </w:r>
+    </w:p>
+    <w:p>
+      <w:pPr>
+        <w:spacing w:before="42"/>
+        <w:ind w:left="23"/>
+        <w:rPr>
+          <w:b/>
+        </w:rPr>
+      </w:pPr>
+      <w:r>
+        <w:rPr>
+          <w:b/>
+        </w:rPr>
+        <w:lastRenderedPageBreak/>
         <w:t>JOBSHEET</w:t>
       </w:r>
       <w:r>
@@ -613,7 +1163,7 @@
           </mc:Choice>
           <mc:Fallback>
             <w:pict>
-              <v:group w14:anchorId="30324296" id="Group 1" o:spid="_x0000_s1026" style="position:absolute;margin-left:1in;margin-top:18.25pt;width:451.4pt;height:1.55pt;z-index:-15728640;mso-wrap-distance-left:0;mso-wrap-distance-right:0;mso-position-horizontal-relative:page" coordsize="57327,196" o:gfxdata="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">
+              <v:group w14:anchorId="2CAAAA9E" id="Group 1" o:spid="_x0000_s1026" style="position:absolute;margin-left:1in;margin-top:18.25pt;width:451.4pt;height:1.55pt;z-index:-15728640;mso-wrap-distance-left:0;mso-wrap-distance-right:0;mso-position-horizontal-relative:page" coordsize="57327,196" o:gfxdata="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">
                 <v:shape id="Graphic 2" o:spid="_x0000_s1027" style="position:absolute;width:57315;height:190;visibility:visible;mso-wrap-style:square;v-text-anchor:top" coordsize="5731510,19050" o:gfxdata="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" path="m5731497,l,,,266,,2794,,19050r5731497,l5731497,xe" fillcolor="#9f9f9f" stroked="f">
                   <v:path arrowok="t"/>
                 </v:shape>
@@ -1571,7 +2121,7 @@
           </mc:Choice>
           <mc:Fallback>
             <w:pict>
-              <v:group w14:anchorId="7A57FCDB" id="Group 8" o:spid="_x0000_s1026" style="position:absolute;margin-left:1in;margin-top:18.45pt;width:451.4pt;height:1.55pt;z-index:-15728128;mso-wrap-distance-left:0;mso-wrap-distance-right:0;mso-position-horizontal-relative:page" coordsize="57327,196" o:gfxdata="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">
+              <v:group w14:anchorId="6EBE66EC" id="Group 8" o:spid="_x0000_s1026" style="position:absolute;margin-left:1in;margin-top:18.45pt;width:451.4pt;height:1.55pt;z-index:-15728128;mso-wrap-distance-left:0;mso-wrap-distance-right:0;mso-position-horizontal-relative:page" coordsize="57327,196" o:gfxdata="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">
                 <v:shape id="Graphic 9" o:spid="_x0000_s1027" style="position:absolute;width:57315;height:190;visibility:visible;mso-wrap-style:square;v-text-anchor:top" coordsize="5731510,19050" o:gfxdata="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" path="m5731497,l,,,635,,3175,,19050r5731497,l5731497,xe" fillcolor="#9f9f9f" stroked="f">
                   <v:path arrowok="t"/>
                 </v:shape>
@@ -2202,7 +2752,7 @@
           </mc:Choice>
           <mc:Fallback>
             <w:pict>
-              <v:group w14:anchorId="66801C29" id="Group 15" o:spid="_x0000_s1026" style="position:absolute;margin-left:1in;margin-top:18.4pt;width:451.4pt;height:1.6pt;z-index:-15727616;mso-wrap-distance-left:0;mso-wrap-distance-right:0;mso-position-horizontal-relative:page" coordsize="57327,203" o:gfxdata="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">
+              <v:group w14:anchorId="3C526ED4" id="Group 15" o:spid="_x0000_s1026" style="position:absolute;margin-left:1in;margin-top:18.4pt;width:451.4pt;height:1.6pt;z-index:-15727616;mso-wrap-distance-left:0;mso-wrap-distance-right:0;mso-position-horizontal-relative:page" coordsize="57327,203" o:gfxdata="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">
                 <v:shape id="Graphic 16" o:spid="_x0000_s1027" style="position:absolute;width:57315;height:190;visibility:visible;mso-wrap-style:square;v-text-anchor:top" coordsize="5731510,19050" o:gfxdata="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" path="m5731497,l,,,1016,,3556,,19050r5731497,l5731497,xe" fillcolor="#9f9f9f" stroked="f">
                   <v:path arrowok="t"/>
                 </v:shape>
@@ -2913,7 +3463,7 @@
           </mc:Choice>
           <mc:Fallback>
             <w:pict>
-              <v:group w14:anchorId="66712EB6" id="Group 22" o:spid="_x0000_s1026" style="position:absolute;margin-left:1in;margin-top:18.4pt;width:451.4pt;height:1.55pt;z-index:-15727104;mso-wrap-distance-left:0;mso-wrap-distance-right:0;mso-position-horizontal-relative:page" coordsize="57327,196" o:gfxdata="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">
+              <v:group w14:anchorId="6C2E2BDF" id="Group 22" o:spid="_x0000_s1026" style="position:absolute;margin-left:1in;margin-top:18.4pt;width:451.4pt;height:1.55pt;z-index:-15727104;mso-wrap-distance-left:0;mso-wrap-distance-right:0;mso-position-horizontal-relative:page" coordsize="57327,196" o:gfxdata="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">
                 <v:shape id="Graphic 23" o:spid="_x0000_s1027" style="position:absolute;width:57315;height:190;visibility:visible;mso-wrap-style:square;v-text-anchor:top" coordsize="5731510,19050" o:gfxdata="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" path="m5731497,l,,,254,,2794,,19050r5731497,l5731497,xe" fillcolor="#9f9f9f" stroked="f">
                   <v:path arrowok="t"/>
                 </v:shape>
@@ -3334,7 +3884,7 @@
           </mc:Choice>
           <mc:Fallback>
             <w:pict>
-              <v:group w14:anchorId="46BFD0DE" id="Group 29" o:spid="_x0000_s1026" style="position:absolute;margin-left:1in;margin-top:18.45pt;width:451.4pt;height:1.55pt;z-index:-15726592;mso-wrap-distance-left:0;mso-wrap-distance-right:0;mso-position-horizontal-relative:page" coordsize="57327,196" o:gfxdata="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">
+              <v:group w14:anchorId="55B2922F" id="Group 29" o:spid="_x0000_s1026" style="position:absolute;margin-left:1in;margin-top:18.45pt;width:451.4pt;height:1.55pt;z-index:-15726592;mso-wrap-distance-left:0;mso-wrap-distance-right:0;mso-position-horizontal-relative:page" coordsize="57327,196" o:gfxdata="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">
                 <v:shape id="Graphic 30" o:spid="_x0000_s1027" style="position:absolute;width:57315;height:190;visibility:visible;mso-wrap-style:square;v-text-anchor:top" coordsize="5731510,19050" o:gfxdata="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" path="m5731497,l,,,254,,2794,,19050r5731497,l5731497,xe" fillcolor="#9f9f9f" stroked="f">
                   <v:path arrowok="t"/>
                 </v:shape>
@@ -3473,7 +4023,7 @@
                     <pic:cNvPicPr/>
                   </pic:nvPicPr>
                   <pic:blipFill>
-                    <a:blip r:embed="rId5" cstate="print"/>
+                    <a:blip r:embed="rId6" cstate="print"/>
                     <a:stretch>
                       <a:fillRect/>
                     </a:stretch>
@@ -3614,7 +4164,7 @@
                     <pic:cNvPicPr/>
                   </pic:nvPicPr>
                   <pic:blipFill>
-                    <a:blip r:embed="rId6" cstate="print"/>
+                    <a:blip r:embed="rId7" cstate="print"/>
                     <a:stretch>
                       <a:fillRect/>
                     </a:stretch>
@@ -4229,7 +4779,7 @@
           </mc:Choice>
           <mc:Fallback>
             <w:pict>
-              <v:group w14:anchorId="369F0705" id="Group 38" o:spid="_x0000_s1026" style="width:451.4pt;height:1.5pt;mso-position-horizontal-relative:char;mso-position-vertical-relative:line" coordsize="57327,190" o:gfxdata="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">
+              <v:group w14:anchorId="677CDFBE" id="Group 38" o:spid="_x0000_s1026" style="width:451.4pt;height:1.5pt;mso-position-horizontal-relative:char;mso-position-vertical-relative:line" coordsize="57327,190" o:gfxdata="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">
                 <v:shape id="Graphic 39" o:spid="_x0000_s1027" style="position:absolute;width:57315;height:190;visibility:visible;mso-wrap-style:square;v-text-anchor:top" coordsize="5731510,19050" o:gfxdata="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" path="m5731497,r-1638,l2540,,,,,2540,,19050r5731497,l5731497,xe" fillcolor="#9f9f9f" stroked="f">
                   <v:path arrowok="t"/>
                 </v:shape>
@@ -4461,7 +5011,7 @@
                     <pic:cNvPicPr/>
                   </pic:nvPicPr>
                   <pic:blipFill>
-                    <a:blip r:embed="rId7" cstate="print"/>
+                    <a:blip r:embed="rId8" cstate="print"/>
                     <a:stretch>
                       <a:fillRect/>
                     </a:stretch>
@@ -4600,7 +5150,7 @@
                     <pic:cNvPicPr/>
                   </pic:nvPicPr>
                   <pic:blipFill>
-                    <a:blip r:embed="rId8" cstate="print"/>
+                    <a:blip r:embed="rId9" cstate="print"/>
                     <a:stretch>
                       <a:fillRect/>
                     </a:stretch>
@@ -4667,6 +5217,7 @@
       <w:r>
         <w:rPr>
           <w:rFonts w:ascii="Symbol" w:hAnsi="Symbol"/>
+          <w:noProof/>
         </w:rPr>
         <w:drawing>
           <wp:inline distT="0" distB="0" distL="0" distR="0" wp14:anchorId="06A5E1D6" wp14:editId="24D58A03">
@@ -4684,7 +5235,7 @@
                     <pic:cNvPicPr/>
                   </pic:nvPicPr>
                   <pic:blipFill>
-                    <a:blip r:embed="rId9"/>
+                    <a:blip r:embed="rId10"/>
                     <a:stretch>
                       <a:fillRect/>
                     </a:stretch>
@@ -4858,6 +5409,7 @@
       <w:r>
         <w:rPr>
           <w:rFonts w:ascii="Symbol" w:hAnsi="Symbol"/>
+          <w:noProof/>
         </w:rPr>
         <w:drawing>
           <wp:inline distT="0" distB="0" distL="0" distR="0" wp14:anchorId="1B96974A" wp14:editId="7B36BDB5">
@@ -4875,7 +5427,7 @@
                     <pic:cNvPicPr/>
                   </pic:nvPicPr>
                   <pic:blipFill>
-                    <a:blip r:embed="rId10"/>
+                    <a:blip r:embed="rId11"/>
                     <a:stretch>
                       <a:fillRect/>
                     </a:stretch>
@@ -4936,6 +5488,7 @@
       </w:pPr>
       <w:r>
         <w:rPr>
+          <w:noProof/>
           <w:sz w:val="20"/>
         </w:rPr>
         <w:drawing>
@@ -4954,7 +5507,7 @@
                     <pic:cNvPicPr/>
                   </pic:nvPicPr>
                   <pic:blipFill>
-                    <a:blip r:embed="rId11"/>
+                    <a:blip r:embed="rId12"/>
                     <a:stretch>
                       <a:fillRect/>
                     </a:stretch>
@@ -5558,7 +6111,7 @@
           </mc:Choice>
           <mc:Fallback>
             <w:pict>
-              <v:group w14:anchorId="4DF92004" id="Group 50" o:spid="_x0000_s1026" style="position:absolute;margin-left:1in;margin-top:18.45pt;width:451.4pt;height:1.55pt;z-index:-15722496;mso-wrap-distance-left:0;mso-wrap-distance-right:0;mso-position-horizontal-relative:page" coordsize="57327,196" o:gfxdata="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">
+              <v:group w14:anchorId="6CA98DD0" id="Group 50" o:spid="_x0000_s1026" style="position:absolute;margin-left:1in;margin-top:18.45pt;width:451.4pt;height:1.55pt;z-index:-15722496;mso-wrap-distance-left:0;mso-wrap-distance-right:0;mso-position-horizontal-relative:page" coordsize="57327,196" o:gfxdata="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">
                 <v:shape id="Graphic 51" o:spid="_x0000_s1027" style="position:absolute;width:57315;height:190;visibility:visible;mso-wrap-style:square;v-text-anchor:top" coordsize="5731510,19050" o:gfxdata="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" path="m5731497,l,,,635,,3175,,19050r5731497,l5731497,xe" fillcolor="#9f9f9f" stroked="f">
                   <v:path arrowok="t"/>
                 </v:shape>
@@ -5752,7 +6305,7 @@
                     <pic:cNvPicPr/>
                   </pic:nvPicPr>
                   <pic:blipFill>
-                    <a:blip r:embed="rId12" cstate="print"/>
+                    <a:blip r:embed="rId13" cstate="print"/>
                     <a:stretch>
                       <a:fillRect/>
                     </a:stretch>
@@ -5875,6 +6428,7 @@
       <w:r>
         <w:rPr>
           <w:rFonts w:ascii="Symbol" w:hAnsi="Symbol"/>
+          <w:noProof/>
         </w:rPr>
         <w:drawing>
           <wp:inline distT="0" distB="0" distL="0" distR="0" wp14:anchorId="5F96709A" wp14:editId="296ABC5B">
@@ -5892,7 +6446,7 @@
                     <pic:cNvPicPr/>
                   </pic:nvPicPr>
                   <pic:blipFill>
-                    <a:blip r:embed="rId13"/>
+                    <a:blip r:embed="rId14"/>
                     <a:stretch>
                       <a:fillRect/>
                     </a:stretch>
@@ -6052,6 +6606,9 @@
         <w:ind w:left="2183" w:firstLine="0"/>
       </w:pPr>
       <w:r>
+        <w:rPr>
+          <w:noProof/>
+        </w:rPr>
         <w:drawing>
           <wp:inline distT="0" distB="0" distL="0" distR="0" wp14:anchorId="631DECEE" wp14:editId="1995EA32">
             <wp:extent cx="3539201" cy="2472193"/>
@@ -6068,7 +6625,7 @@
                     <pic:cNvPicPr/>
                   </pic:nvPicPr>
                   <pic:blipFill>
-                    <a:blip r:embed="rId14"/>
+                    <a:blip r:embed="rId15"/>
                     <a:stretch>
                       <a:fillRect/>
                     </a:stretch>
@@ -6130,6 +6687,7 @@
       </w:pPr>
       <w:r>
         <w:rPr>
+          <w:noProof/>
           <w:sz w:val="20"/>
         </w:rPr>
         <w:drawing>
@@ -6148,7 +6706,7 @@
                     <pic:cNvPicPr/>
                   </pic:nvPicPr>
                   <pic:blipFill>
-                    <a:blip r:embed="rId15"/>
+                    <a:blip r:embed="rId16"/>
                     <a:stretch>
                       <a:fillRect/>
                     </a:stretch>
@@ -6535,7 +7093,7 @@
           </mc:Choice>
           <mc:Fallback>
             <w:pict>
-              <v:group w14:anchorId="613E06B1" id="Group 61" o:spid="_x0000_s1026" style="position:absolute;margin-left:1in;margin-top:19pt;width:451.4pt;height:1.6pt;z-index:-15720448;mso-wrap-distance-left:0;mso-wrap-distance-right:0;mso-position-horizontal-relative:page" coordsize="57327,203" o:gfxdata="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">
+              <v:group w14:anchorId="019DD74E" id="Group 61" o:spid="_x0000_s1026" style="position:absolute;margin-left:1in;margin-top:19pt;width:451.4pt;height:1.6pt;z-index:-15720448;mso-wrap-distance-left:0;mso-wrap-distance-right:0;mso-position-horizontal-relative:page" coordsize="57327,203" o:gfxdata="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">
                 <v:shape id="Graphic 62" o:spid="_x0000_s1027" style="position:absolute;width:57315;height:190;visibility:visible;mso-wrap-style:square;v-text-anchor:top" coordsize="5731510,19050" o:gfxdata="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" path="m5731497,l,,,1016,,3556,,19050r5731497,l5731497,xe" fillcolor="#9f9f9f" stroked="f">
                   <v:path arrowok="t"/>
                 </v:shape>
@@ -7002,7 +7560,7 @@
                     <pic:cNvPicPr/>
                   </pic:nvPicPr>
                   <pic:blipFill>
-                    <a:blip r:embed="rId16" cstate="print"/>
+                    <a:blip r:embed="rId17" cstate="print"/>
                     <a:stretch>
                       <a:fillRect/>
                     </a:stretch>
@@ -7068,6 +7626,9 @@
         </w:rPr>
       </w:pPr>
       <w:r>
+        <w:rPr>
+          <w:noProof/>
+        </w:rPr>
         <w:drawing>
           <wp:inline distT="0" distB="0" distL="0" distR="0" wp14:anchorId="6B1A234A" wp14:editId="5AB39203">
             <wp:extent cx="3525138" cy="2415540"/>
@@ -7084,7 +7645,7 @@
                     <pic:cNvPicPr/>
                   </pic:nvPicPr>
                   <pic:blipFill>
-                    <a:blip r:embed="rId17"/>
+                    <a:blip r:embed="rId18"/>
                     <a:stretch>
                       <a:fillRect/>
                     </a:stretch>
@@ -7342,7 +7903,7 @@
                     <pic:cNvPicPr/>
                   </pic:nvPicPr>
                   <pic:blipFill>
-                    <a:blip r:embed="rId18" cstate="print"/>
+                    <a:blip r:embed="rId19" cstate="print"/>
                     <a:stretch>
                       <a:fillRect/>
                     </a:stretch>
@@ -7875,7 +8436,7 @@
           </mc:Choice>
           <mc:Fallback>
             <w:pict>
-              <v:group w14:anchorId="0CCCB7A4" id="Group 71" o:spid="_x0000_s1026" style="position:absolute;margin-left:1in;margin-top:18.45pt;width:451.4pt;height:1.55pt;z-index:-15718912;mso-wrap-distance-left:0;mso-wrap-distance-right:0;mso-position-horizontal-relative:page" coordsize="57327,196" o:gfxdata="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">
+              <v:group w14:anchorId="4305ED3E" id="Group 71" o:spid="_x0000_s1026" style="position:absolute;margin-left:1in;margin-top:18.45pt;width:451.4pt;height:1.55pt;z-index:-15718912;mso-wrap-distance-left:0;mso-wrap-distance-right:0;mso-position-horizontal-relative:page" coordsize="57327,196" o:gfxdata="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">
                 <v:shape id="Graphic 72" o:spid="_x0000_s1027" style="position:absolute;width:57315;height:190;visibility:visible;mso-wrap-style:square;v-text-anchor:top" coordsize="5731510,19050" o:gfxdata="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" path="m5731497,l,,,381,,2921,,19050r5731497,l5731497,xe" fillcolor="#9f9f9f" stroked="f">
                   <v:path arrowok="t"/>
                 </v:shape>
@@ -8101,7 +8662,7 @@
                     <pic:cNvPicPr/>
                   </pic:nvPicPr>
                   <pic:blipFill>
-                    <a:blip r:embed="rId19" cstate="print"/>
+                    <a:blip r:embed="rId20" cstate="print"/>
                     <a:stretch>
                       <a:fillRect/>
                     </a:stretch>
@@ -8267,7 +8828,7 @@
                     <pic:cNvPicPr/>
                   </pic:nvPicPr>
                   <pic:blipFill>
-                    <a:blip r:embed="rId20"/>
+                    <a:blip r:embed="rId21"/>
                     <a:stretch>
                       <a:fillRect/>
                     </a:stretch>
@@ -8369,6 +8930,7 @@
       </w:pPr>
       <w:r>
         <w:rPr>
+          <w:noProof/>
           <w:sz w:val="20"/>
         </w:rPr>
         <w:lastRenderedPageBreak/>
@@ -8388,7 +8950,7 @@
                     <pic:cNvPicPr/>
                   </pic:nvPicPr>
                   <pic:blipFill>
-                    <a:blip r:embed="rId21"/>
+                    <a:blip r:embed="rId22"/>
                     <a:stretch>
                       <a:fillRect/>
                     </a:stretch>
@@ -8527,7 +9089,7 @@
                           <pic:cNvPicPr/>
                         </pic:nvPicPr>
                         <pic:blipFill>
-                          <a:blip r:embed="rId22" cstate="print"/>
+                          <a:blip r:embed="rId23" cstate="print"/>
                           <a:stretch>
                             <a:fillRect/>
                           </a:stretch>
@@ -8581,7 +9143,7 @@
                           <pic:cNvPicPr/>
                         </pic:nvPicPr>
                         <pic:blipFill>
-                          <a:blip r:embed="rId23" cstate="print"/>
+                          <a:blip r:embed="rId24" cstate="print"/>
                           <a:stretch>
                             <a:fillRect/>
                           </a:stretch>
@@ -8723,7 +9285,7 @@
                           <pic:cNvPicPr/>
                         </pic:nvPicPr>
                         <pic:blipFill>
-                          <a:blip r:embed="rId24" cstate="print"/>
+                          <a:blip r:embed="rId25" cstate="print"/>
                           <a:stretch>
                             <a:fillRect/>
                           </a:stretch>
@@ -8778,7 +9340,7 @@
                           <pic:cNvPicPr/>
                         </pic:nvPicPr>
                         <pic:blipFill>
-                          <a:blip r:embed="rId25" cstate="print"/>
+                          <a:blip r:embed="rId26" cstate="print"/>
                           <a:stretch>
                             <a:fillRect/>
                           </a:stretch>
@@ -8853,7 +9415,7 @@
                     <pic:cNvPicPr/>
                   </pic:nvPicPr>
                   <pic:blipFill>
-                    <a:blip r:embed="rId26" cstate="print"/>
+                    <a:blip r:embed="rId27" cstate="print"/>
                     <a:stretch>
                       <a:fillRect/>
                     </a:stretch>
@@ -8988,7 +9550,7 @@
                     <pic:cNvPicPr/>
                   </pic:nvPicPr>
                   <pic:blipFill>
-                    <a:blip r:embed="rId27"/>
+                    <a:blip r:embed="rId28"/>
                     <a:stretch>
                       <a:fillRect/>
                     </a:stretch>
@@ -9548,7 +10110,7 @@
           </mc:Choice>
           <mc:Fallback>
             <w:pict>
-              <v:group w14:anchorId="1C433DAB" id="Group 87" o:spid="_x0000_s1026" style="position:absolute;margin-left:1in;margin-top:18.4pt;width:451.4pt;height:1.55pt;z-index:-15716864;mso-wrap-distance-left:0;mso-wrap-distance-right:0;mso-position-horizontal-relative:page" coordsize="57327,196" o:gfxdata="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">
+              <v:group w14:anchorId="279F4E82" id="Group 87" o:spid="_x0000_s1026" style="position:absolute;margin-left:1in;margin-top:18.4pt;width:451.4pt;height:1.55pt;z-index:-15716864;mso-wrap-distance-left:0;mso-wrap-distance-right:0;mso-position-horizontal-relative:page" coordsize="57327,196" o:gfxdata="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">
                 <v:shape id="Graphic 88" o:spid="_x0000_s1027" style="position:absolute;width:57315;height:190;visibility:visible;mso-wrap-style:square;v-text-anchor:top" coordsize="5731510,19050" o:gfxdata="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" path="m5731497,l,,,647,,3175,,19050r5731497,l5731497,xe" fillcolor="#9f9f9f" stroked="f">
                   <v:path arrowok="t"/>
                 </v:shape>
@@ -9770,6 +10332,7 @@
       <w:r>
         <w:rPr>
           <w:rFonts w:ascii="Courier New" w:hAnsi="Courier New"/>
+          <w:noProof/>
         </w:rPr>
         <w:drawing>
           <wp:inline distT="0" distB="0" distL="0" distR="0" wp14:anchorId="13AA7154" wp14:editId="47230ABD">
@@ -9787,7 +10350,7 @@
                     <pic:cNvPicPr/>
                   </pic:nvPicPr>
                   <pic:blipFill>
-                    <a:blip r:embed="rId28"/>
+                    <a:blip r:embed="rId29"/>
                     <a:stretch>
                       <a:fillRect/>
                     </a:stretch>
@@ -9854,6 +10417,7 @@
       <w:r>
         <w:rPr>
           <w:rFonts w:ascii="Symbol" w:hAnsi="Symbol"/>
+          <w:noProof/>
         </w:rPr>
         <w:drawing>
           <wp:inline distT="0" distB="0" distL="0" distR="0" wp14:anchorId="0049A2EB" wp14:editId="4F22A20D">
@@ -9871,7 +10435,7 @@
                     <pic:cNvPicPr/>
                   </pic:nvPicPr>
                   <pic:blipFill>
-                    <a:blip r:embed="rId29"/>
+                    <a:blip r:embed="rId30"/>
                     <a:stretch>
                       <a:fillRect/>
                     </a:stretch>
@@ -10534,7 +11098,7 @@
           </mc:Choice>
           <mc:Fallback>
             <w:pict>
-              <v:group w14:anchorId="1DF1AD48" id="Group 96" o:spid="_x0000_s1026" style="position:absolute;margin-left:1in;margin-top:18.3pt;width:451.4pt;height:1.55pt;z-index:-15715840;mso-wrap-distance-left:0;mso-wrap-distance-right:0;mso-position-horizontal-relative:page" coordsize="57327,196" o:gfxdata="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">
+              <v:group w14:anchorId="19E98F24" id="Group 96" o:spid="_x0000_s1026" style="position:absolute;margin-left:1in;margin-top:18.3pt;width:451.4pt;height:1.55pt;z-index:-15715840;mso-wrap-distance-left:0;mso-wrap-distance-right:0;mso-position-horizontal-relative:page" coordsize="57327,196" o:gfxdata="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">
                 <v:shape id="Graphic 97" o:spid="_x0000_s1027" style="position:absolute;width:57315;height:190;visibility:visible;mso-wrap-style:square;v-text-anchor:top" coordsize="5731510,19050" o:gfxdata="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" path="m5731497,l,,,254,,2794,,19050r5731497,l5731497,xe" fillcolor="#9f9f9f" stroked="f">
                   <v:path arrowok="t"/>
                 </v:shape>
@@ -10693,6 +11257,7 @@
       <w:r>
         <w:rPr>
           <w:rFonts w:ascii="Symbol" w:hAnsi="Symbol"/>
+          <w:noProof/>
         </w:rPr>
         <w:drawing>
           <wp:inline distT="0" distB="0" distL="0" distR="0" wp14:anchorId="22CAE41C" wp14:editId="5C9DDE10">
@@ -10710,7 +11275,7 @@
                     <pic:cNvPicPr/>
                   </pic:nvPicPr>
                   <pic:blipFill>
-                    <a:blip r:embed="rId30"/>
+                    <a:blip r:embed="rId31"/>
                     <a:stretch>
                       <a:fillRect/>
                     </a:stretch>
@@ -10822,6 +11387,9 @@
         <w:ind w:left="1462" w:firstLine="0"/>
       </w:pPr>
       <w:r>
+        <w:rPr>
+          <w:noProof/>
+        </w:rPr>
         <w:drawing>
           <wp:inline distT="0" distB="0" distL="0" distR="0" wp14:anchorId="5905756F" wp14:editId="4176FC90">
             <wp:extent cx="3429479" cy="2419688"/>
@@ -10838,7 +11406,7 @@
                     <pic:cNvPicPr/>
                   </pic:nvPicPr>
                   <pic:blipFill>
-                    <a:blip r:embed="rId31"/>
+                    <a:blip r:embed="rId32"/>
                     <a:stretch>
                       <a:fillRect/>
                     </a:stretch>
@@ -11395,7 +11963,7 @@
           </mc:Choice>
           <mc:Fallback>
             <w:pict>
-              <v:group w14:anchorId="134BF10C" id="Group 105" o:spid="_x0000_s1026" style="position:absolute;margin-left:1in;margin-top:18.45pt;width:451.4pt;height:1.5pt;z-index:-15714304;mso-wrap-distance-left:0;mso-wrap-distance-right:0;mso-position-horizontal-relative:page" coordsize="57327,190" o:gfxdata="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">
+              <v:group w14:anchorId="1319C29A" id="Group 105" o:spid="_x0000_s1026" style="position:absolute;margin-left:1in;margin-top:18.45pt;width:451.4pt;height:1.5pt;z-index:-15714304;mso-wrap-distance-left:0;mso-wrap-distance-right:0;mso-position-horizontal-relative:page" coordsize="57327,190" o:gfxdata="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">
                 <v:shape id="Graphic 106" o:spid="_x0000_s1027" style="position:absolute;width:57315;height:190;visibility:visible;mso-wrap-style:square;v-text-anchor:top" coordsize="5731510,19050" o:gfxdata="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" path="m5731497,r-1638,l2540,,,,,2540,,19050r5731497,l5731497,xe" fillcolor="#9f9f9f" stroked="f">
                   <v:path arrowok="t"/>
                 </v:shape>
@@ -11501,6 +12069,7 @@
       <w:r>
         <w:rPr>
           <w:b/>
+          <w:noProof/>
           <w:sz w:val="20"/>
         </w:rPr>
         <w:drawing>
@@ -11519,7 +12088,7 @@
                     <pic:cNvPicPr/>
                   </pic:nvPicPr>
                   <pic:blipFill>
-                    <a:blip r:embed="rId32"/>
+                    <a:blip r:embed="rId33"/>
                     <a:stretch>
                       <a:fillRect/>
                     </a:stretch>
@@ -11686,6 +12255,7 @@
       <w:r>
         <w:rPr>
           <w:rFonts w:ascii="Symbol" w:hAnsi="Symbol"/>
+          <w:noProof/>
         </w:rPr>
         <w:lastRenderedPageBreak/>
         <w:drawing>
@@ -11704,7 +12274,7 @@
                     <pic:cNvPicPr/>
                   </pic:nvPicPr>
                   <pic:blipFill>
-                    <a:blip r:embed="rId33"/>
+                    <a:blip r:embed="rId34"/>
                     <a:stretch>
                       <a:fillRect/>
                     </a:stretch>
@@ -11798,7 +12368,7 @@
                     <pic:cNvPicPr/>
                   </pic:nvPicPr>
                   <pic:blipFill>
-                    <a:blip r:embed="rId34" cstate="print"/>
+                    <a:blip r:embed="rId35" cstate="print"/>
                     <a:stretch>
                       <a:fillRect/>
                     </a:stretch>
@@ -11910,6 +12480,7 @@
       <w:r>
         <w:rPr>
           <w:rFonts w:ascii="Symbol" w:hAnsi="Symbol"/>
+          <w:noProof/>
         </w:rPr>
         <w:drawing>
           <wp:inline distT="0" distB="0" distL="0" distR="0" wp14:anchorId="555C33B0" wp14:editId="4D37BDC7">
@@ -11927,7 +12498,7 @@
                     <pic:cNvPicPr/>
                   </pic:nvPicPr>
                   <pic:blipFill>
-                    <a:blip r:embed="rId35"/>
+                    <a:blip r:embed="rId36"/>
                     <a:stretch>
                       <a:fillRect/>
                     </a:stretch>
@@ -12035,7 +12606,7 @@
                     <pic:cNvPicPr/>
                   </pic:nvPicPr>
                   <pic:blipFill>
-                    <a:blip r:embed="rId36" cstate="print"/>
+                    <a:blip r:embed="rId37" cstate="print"/>
                     <a:stretch>
                       <a:fillRect/>
                     </a:stretch>
@@ -12283,7 +12854,7 @@
                     <pic:cNvPicPr/>
                   </pic:nvPicPr>
                   <pic:blipFill>
-                    <a:blip r:embed="rId37" cstate="print"/>
+                    <a:blip r:embed="rId38" cstate="print"/>
                     <a:stretch>
                       <a:fillRect/>
                     </a:stretch>
@@ -12612,7 +13183,7 @@
                     <pic:cNvPicPr/>
                   </pic:nvPicPr>
                   <pic:blipFill>
-                    <a:blip r:embed="rId38" cstate="print"/>
+                    <a:blip r:embed="rId39" cstate="print"/>
                     <a:stretch>
                       <a:fillRect/>
                     </a:stretch>
@@ -12679,6 +13250,7 @@
       <w:r>
         <w:rPr>
           <w:rFonts w:ascii="Symbol" w:hAnsi="Symbol"/>
+          <w:noProof/>
         </w:rPr>
         <w:drawing>
           <wp:inline distT="0" distB="0" distL="0" distR="0" wp14:anchorId="303BB65F" wp14:editId="7DD02F67">
@@ -12696,7 +13268,7 @@
                     <pic:cNvPicPr/>
                   </pic:nvPicPr>
                   <pic:blipFill>
-                    <a:blip r:embed="rId39"/>
+                    <a:blip r:embed="rId40"/>
                     <a:stretch>
                       <a:fillRect/>
                     </a:stretch>
@@ -12941,7 +13513,7 @@
                     <pic:cNvPicPr/>
                   </pic:nvPicPr>
                   <pic:blipFill>
-                    <a:blip r:embed="rId40" cstate="print"/>
+                    <a:blip r:embed="rId41" cstate="print"/>
                     <a:stretch>
                       <a:fillRect/>
                     </a:stretch>
@@ -13087,7 +13659,7 @@
                     <pic:cNvPicPr/>
                   </pic:nvPicPr>
                   <pic:blipFill>
-                    <a:blip r:embed="rId41" cstate="print"/>
+                    <a:blip r:embed="rId42" cstate="print"/>
                     <a:stretch>
                       <a:fillRect/>
                     </a:stretch>
@@ -13524,7 +14096,7 @@
           </mc:Choice>
           <mc:Fallback>
             <w:pict>
-              <v:group w14:anchorId="172D34EE" id="Group 122" o:spid="_x0000_s1026" style="position:absolute;margin-left:1in;margin-top:18.35pt;width:451.4pt;height:1.6pt;z-index:-15709696;mso-wrap-distance-left:0;mso-wrap-distance-right:0;mso-position-horizontal-relative:page" coordsize="57327,203" o:gfxdata="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">
+              <v:group w14:anchorId="30B82FF8" id="Group 122" o:spid="_x0000_s1026" style="position:absolute;margin-left:1in;margin-top:18.35pt;width:451.4pt;height:1.6pt;z-index:-15709696;mso-wrap-distance-left:0;mso-wrap-distance-right:0;mso-position-horizontal-relative:page" coordsize="57327,203" o:gfxdata="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">
                 <v:shape id="Graphic 123" o:spid="_x0000_s1027" style="position:absolute;width:57315;height:190;visibility:visible;mso-wrap-style:square;v-text-anchor:top" coordsize="5731510,19050" o:gfxdata="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" path="m5731497,l,,,952,,3492,,19050r5731497,l5731497,xe" fillcolor="#9f9f9f" stroked="f">
                   <v:path arrowok="t"/>
                 </v:shape>
@@ -13698,6 +14270,7 @@
       <w:r>
         <w:rPr>
           <w:rFonts w:ascii="Symbol" w:hAnsi="Symbol"/>
+          <w:noProof/>
         </w:rPr>
         <w:drawing>
           <wp:inline distT="0" distB="0" distL="0" distR="0" wp14:anchorId="64E477C5" wp14:editId="788F490A">
@@ -13715,7 +14288,7 @@
                     <pic:cNvPicPr/>
                   </pic:nvPicPr>
                   <pic:blipFill>
-                    <a:blip r:embed="rId42"/>
+                    <a:blip r:embed="rId43"/>
                     <a:stretch>
                       <a:fillRect/>
                     </a:stretch>
@@ -13882,7 +14455,7 @@
                     <pic:cNvPicPr/>
                   </pic:nvPicPr>
                   <pic:blipFill>
-                    <a:blip r:embed="rId43" cstate="print"/>
+                    <a:blip r:embed="rId44" cstate="print"/>
                     <a:stretch>
                       <a:fillRect/>
                     </a:stretch>
@@ -13997,7 +14570,7 @@
                     <pic:cNvPicPr/>
                   </pic:nvPicPr>
                   <pic:blipFill>
-                    <a:blip r:embed="rId44" cstate="print"/>
+                    <a:blip r:embed="rId45" cstate="print"/>
                     <a:stretch>
                       <a:fillRect/>
                     </a:stretch>
@@ -14083,6 +14656,7 @@
       <w:r>
         <w:rPr>
           <w:b/>
+          <w:noProof/>
         </w:rPr>
         <w:drawing>
           <wp:inline distT="0" distB="0" distL="0" distR="0" wp14:anchorId="739FBCC9" wp14:editId="357BDFFC">
@@ -14100,7 +14674,7 @@
                     <pic:cNvPicPr/>
                   </pic:nvPicPr>
                   <pic:blipFill>
-                    <a:blip r:embed="rId45"/>
+                    <a:blip r:embed="rId46"/>
                     <a:stretch>
                       <a:fillRect/>
                     </a:stretch>
@@ -14281,6 +14855,7 @@
       </w:pPr>
       <w:r>
         <w:rPr>
+          <w:noProof/>
           <w:sz w:val="20"/>
         </w:rPr>
         <w:drawing>
@@ -14299,7 +14874,7 @@
                     <pic:cNvPicPr/>
                   </pic:nvPicPr>
                   <pic:blipFill>
-                    <a:blip r:embed="rId46"/>
+                    <a:blip r:embed="rId47"/>
                     <a:stretch>
                       <a:fillRect/>
                     </a:stretch>
@@ -14572,6 +15147,7 @@
       <w:r>
         <w:rPr>
           <w:rFonts w:ascii="Consolas" w:hAnsi="Consolas"/>
+          <w:noProof/>
           <w:sz w:val="21"/>
         </w:rPr>
         <w:drawing>
@@ -14590,7 +15166,7 @@
                     <pic:cNvPicPr/>
                   </pic:nvPicPr>
                   <pic:blipFill>
-                    <a:blip r:embed="rId47"/>
+                    <a:blip r:embed="rId48"/>
                     <a:stretch>
                       <a:fillRect/>
                     </a:stretch>
@@ -15013,7 +15589,7 @@
           </mc:Choice>
           <mc:Fallback>
             <w:pict>
-              <v:group w14:anchorId="76D7413E" id="Group 136" o:spid="_x0000_s1026" style="position:absolute;margin-left:68.25pt;margin-top:148.05pt;width:451.4pt;height:1.6pt;z-index:-251650560;mso-wrap-distance-left:0;mso-wrap-distance-right:0;mso-position-horizontal-relative:page" coordsize="57327,203" o:gfxdata="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">
+              <v:group w14:anchorId="2C818756" id="Group 136" o:spid="_x0000_s1026" style="position:absolute;margin-left:68.25pt;margin-top:148.05pt;width:451.4pt;height:1.6pt;z-index:-251650560;mso-wrap-distance-left:0;mso-wrap-distance-right:0;mso-position-horizontal-relative:page" coordsize="57327,203" o:gfxdata="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">
                 <v:shape id="Graphic 137" o:spid="_x0000_s1027" style="position:absolute;width:57315;height:190;visibility:visible;mso-wrap-style:square;v-text-anchor:top" coordsize="5731510,19050" o:gfxdata="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" path="m5731497,l,,,952,,3492,,19050r5731497,l5731497,xe" fillcolor="#9f9f9f" stroked="f">
                   <v:path arrowok="t"/>
                 </v:shape>
@@ -15041,6 +15617,7 @@
       <w:r>
         <w:rPr>
           <w:rFonts w:ascii="Symbol" w:hAnsi="Symbol"/>
+          <w:noProof/>
         </w:rPr>
         <w:drawing>
           <wp:inline distT="0" distB="0" distL="0" distR="0" wp14:anchorId="7E0A56D6" wp14:editId="6DB255A3">
@@ -15058,7 +15635,7 @@
                     <pic:cNvPicPr/>
                   </pic:nvPicPr>
                   <pic:blipFill>
-                    <a:blip r:embed="rId48"/>
+                    <a:blip r:embed="rId49"/>
                     <a:stretch>
                       <a:fillRect/>
                     </a:stretch>
@@ -15234,6 +15811,9 @@
               <w:ind w:left="0" w:right="7128" w:firstLine="0"/>
             </w:pPr>
             <w:r>
+              <w:rPr>
+                <w:noProof/>
+              </w:rPr>
               <w:drawing>
                 <wp:inline distT="0" distB="0" distL="0" distR="0" wp14:anchorId="7E44D35A" wp14:editId="5FA494F5">
                   <wp:extent cx="2571008" cy="845728"/>
@@ -15250,7 +15830,7 @@
                           <pic:cNvPicPr/>
                         </pic:nvPicPr>
                         <pic:blipFill>
-                          <a:blip r:embed="rId49"/>
+                          <a:blip r:embed="rId50"/>
                           <a:stretch>
                             <a:fillRect/>
                           </a:stretch>
@@ -15305,7 +15885,7 @@
                           <pic:cNvPicPr/>
                         </pic:nvPicPr>
                         <pic:blipFill>
-                          <a:blip r:embed="rId50"/>
+                          <a:blip r:embed="rId51"/>
                           <a:stretch>
                             <a:fillRect/>
                           </a:stretch>
@@ -15498,7 +16078,7 @@
                     </pic:cNvPicPr>
                   </pic:nvPicPr>
                   <pic:blipFill rotWithShape="1">
-                    <a:blip r:embed="rId51" cstate="print">
+                    <a:blip r:embed="rId52" cstate="print">
                       <a:extLst>
                         <a:ext uri="{28A0092B-C50C-407E-A947-70E740481C1C}">
                           <a14:useLocalDpi xmlns:a14="http://schemas.microsoft.com/office/drawing/2010/main" val="0"/>
@@ -16021,7 +16601,7 @@
           </mc:Choice>
           <mc:Fallback>
             <w:pict>
-              <v:group w14:anchorId="6391A1A7" id="Group 143" o:spid="_x0000_s1026" style="position:absolute;margin-left:67.8pt;margin-top:161.95pt;width:451.4pt;height:1.55pt;z-index:-251648512;mso-wrap-distance-left:0;mso-wrap-distance-right:0;mso-position-horizontal-relative:page" coordsize="57327,196" o:gfxdata="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">
+              <v:group w14:anchorId="434833AE" id="Group 143" o:spid="_x0000_s1026" style="position:absolute;margin-left:67.8pt;margin-top:161.95pt;width:451.4pt;height:1.55pt;z-index:-251648512;mso-wrap-distance-left:0;mso-wrap-distance-right:0;mso-position-horizontal-relative:page" coordsize="57327,196" o:gfxdata="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">
                 <v:shape id="Graphic 144" o:spid="_x0000_s1027" style="position:absolute;width:57315;height:190;visibility:visible;mso-wrap-style:square;v-text-anchor:top" coordsize="5731510,19050" o:gfxdata="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" path="m5731497,l,,,266,,2794,,19050r5731497,l5731497,xe" fillcolor="#9f9f9f" stroked="f">
                   <v:path arrowok="t"/>
                 </v:shape>
@@ -16048,6 +16628,7 @@
       </w:r>
       <w:r>
         <w:rPr>
+          <w:noProof/>
           <w:sz w:val="20"/>
         </w:rPr>
         <w:drawing>
@@ -16066,7 +16647,7 @@
                     <pic:cNvPicPr/>
                   </pic:nvPicPr>
                   <pic:blipFill>
-                    <a:blip r:embed="rId52"/>
+                    <a:blip r:embed="rId53"/>
                     <a:stretch>
                       <a:fillRect/>
                     </a:stretch>
@@ -16842,7 +17423,7 @@
           </mc:Choice>
           <mc:Fallback>
             <w:pict>
-              <v:group w14:anchorId="5739CA10" id="Group 150" o:spid="_x0000_s1026" style="position:absolute;margin-left:1in;margin-top:18.4pt;width:451.4pt;height:1.55pt;z-index:-15705600;mso-wrap-distance-left:0;mso-wrap-distance-right:0;mso-position-horizontal-relative:page" coordsize="57327,196" o:gfxdata="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">
+              <v:group w14:anchorId="0DDD9198" id="Group 150" o:spid="_x0000_s1026" style="position:absolute;margin-left:1in;margin-top:18.4pt;width:451.4pt;height:1.55pt;z-index:-15705600;mso-wrap-distance-left:0;mso-wrap-distance-right:0;mso-position-horizontal-relative:page" coordsize="57327,196" o:gfxdata="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">
                 <v:shape id="Graphic 151" o:spid="_x0000_s1027" style="position:absolute;width:57315;height:190;visibility:visible;mso-wrap-style:square;v-text-anchor:top" coordsize="5731510,19050" o:gfxdata="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" path="m5731497,l,,,635,,3175,,19050r5731497,l5731497,xe" fillcolor="#9f9f9f" stroked="f">
                   <v:path arrowok="t"/>
                 </v:shape>

</xml_diff>